<commit_message>
small flyer and misc typos and tweaks
</commit_message>
<xml_diff>
--- a/ztemp2026/WellfeetlPressRelease2026.docx
+++ b/ztemp2026/WellfeetlPressRelease2026.docx
@@ -589,7 +589,7 @@
           <w:szCs w:val="14"/>
         </w:rPr>
         <w:drawing>
-          <wp:anchor distT="0" distB="0" distL="114300" distR="114300" simplePos="0" relativeHeight="251659264" behindDoc="0" locked="0" layoutInCell="1" allowOverlap="1" wp14:anchorId="7597AE33" wp14:editId="7C66A6FE">
+          <wp:anchor distT="0" distB="0" distL="114300" distR="114300" simplePos="0" relativeHeight="251659264" behindDoc="0" locked="0" layoutInCell="1" allowOverlap="1" wp14:anchorId="7597AE33" wp14:editId="6AF8E92E">
             <wp:simplePos x="0" y="0"/>
             <wp:positionH relativeFrom="column">
               <wp:posOffset>1362502</wp:posOffset>
@@ -840,6 +840,14 @@
         </w:rPr>
         <w:t xml:space="preserve">Critical Mass, </w:t>
       </w:r>
+      <w:r>
+        <w:rPr>
+          <w:rFonts w:ascii="Segoe UI Emoji" w:eastAsia="Comic Sans MS" w:hAnsi="Segoe UI Emoji" w:cs="Segoe UI Emoji"/>
+          <w:sz w:val="14"/>
+          <w:szCs w:val="14"/>
+        </w:rPr>
+        <w:t>✨</w:t>
+      </w:r>
       <w:proofErr w:type="spellStart"/>
       <w:r>
         <w:rPr>
@@ -850,13 +858,47 @@
         <w:t>Drumz</w:t>
       </w:r>
       <w:proofErr w:type="spellEnd"/>
-      <w:r>
-        <w:rPr>
-          <w:rFonts w:ascii="Comic Sans MS" w:eastAsia="Comic Sans MS" w:hAnsi="Comic Sans MS" w:cs="Comic Sans MS"/>
-          <w:sz w:val="14"/>
-          <w:szCs w:val="14"/>
-        </w:rPr>
-        <w:t>, and Movement Arts Cape Cod.</w:t>
+      <w:proofErr w:type="gramStart"/>
+      <w:r>
+        <w:rPr>
+          <w:rFonts w:ascii="Segoe UI Emoji" w:eastAsia="Comic Sans MS" w:hAnsi="Segoe UI Emoji" w:cs="Segoe UI Emoji"/>
+          <w:sz w:val="14"/>
+          <w:szCs w:val="14"/>
+        </w:rPr>
+        <w:t>✨</w:t>
+      </w:r>
+      <w:r>
+        <w:rPr>
+          <w:rFonts w:ascii="Comic Sans MS" w:eastAsia="Comic Sans MS" w:hAnsi="Comic Sans MS" w:cs="Comic Sans MS"/>
+          <w:sz w:val="14"/>
+          <w:szCs w:val="14"/>
+        </w:rPr>
+        <w:t>,</w:t>
+      </w:r>
+      <w:r>
+        <w:rPr>
+          <w:rFonts w:ascii="Comic Sans MS" w:eastAsia="Comic Sans MS" w:hAnsi="Comic Sans MS" w:cs="Comic Sans MS"/>
+          <w:sz w:val="6"/>
+          <w:szCs w:val="6"/>
+        </w:rPr>
+        <w:t>,</w:t>
+      </w:r>
+      <w:proofErr w:type="gramEnd"/>
+      <w:r>
+        <w:rPr>
+          <w:rFonts w:ascii="Comic Sans MS" w:eastAsia="Comic Sans MS" w:hAnsi="Comic Sans MS" w:cs="Comic Sans MS"/>
+          <w:sz w:val="6"/>
+          <w:szCs w:val="6"/>
+        </w:rPr>
+        <w:t xml:space="preserve"> </w:t>
+      </w:r>
+      <w:r>
+        <w:rPr>
+          <w:rFonts w:ascii="Comic Sans MS" w:eastAsia="Comic Sans MS" w:hAnsi="Comic Sans MS" w:cs="Comic Sans MS"/>
+          <w:sz w:val="14"/>
+          <w:szCs w:val="14"/>
+        </w:rPr>
+        <w:t>and Movement Arts Cape Cod.</w:t>
       </w:r>
     </w:p>
     <w:p>

</xml_diff>